<commit_message>
se corrigio informe de datos generales informe
</commit_message>
<xml_diff>
--- a/plantillas/word_informe_datos_generales.docx
+++ b/plantillas/word_informe_datos_generales.docx
@@ -1211,22 +1211,6 @@
           <w:szCs w:val="24"/>
           <w:lang w:val="es-ES_tradnl"/>
         </w:rPr>
-        <w:t>2.</w:t>
-      </w:r>
-      <w:r>
-        <w:rPr>
-          <w:sz w:val="24"/>
-          <w:szCs w:val="24"/>
-          <w:lang w:val="es-ES_tradnl"/>
-        </w:rPr>
-        <w:tab/>
-      </w:r>
-      <w:r>
-        <w:rPr>
-          <w:sz w:val="24"/>
-          <w:szCs w:val="24"/>
-          <w:lang w:val="es-ES_tradnl"/>
-        </w:rPr>
         <w:t>Consecuencia</w:t>
       </w:r>
       <w:r>
@@ -1252,15 +1236,25 @@
           <w:szCs w:val="24"/>
           <w:lang w:val="es-ES_tradnl"/>
         </w:rPr>
-        <w:fldChar w:fldCharType="begin"/>
-      </w:r>
-      <w:r>
-        <w:rPr>
-          <w:sz w:val="24"/>
-          <w:szCs w:val="24"/>
-          <w:lang w:val="es-ES_tradnl"/>
-        </w:rPr>
-        <w:instrText xml:space="preserve"> MERGEFIELD "CONSECUENCIA_ACCIDENTE" </w:instrText>
+        <w:t>${</w:t>
+      </w:r>
+      <w:proofErr w:type="spellStart"/>
+      <w:r>
+        <w:rPr>
+          <w:sz w:val="24"/>
+          <w:szCs w:val="24"/>
+          <w:lang w:val="es-ES_tradnl"/>
+        </w:rPr>
+        <w:t>acc_consecuencia</w:t>
+      </w:r>
+      <w:proofErr w:type="spellEnd"/>
+      <w:r>
+        <w:rPr>
+          <w:sz w:val="24"/>
+          <w:szCs w:val="24"/>
+          <w:lang w:val="es-ES_tradnl"/>
+        </w:rPr>
+        <w:t>}</w:t>
       </w:r>
     </w:p>
     <w:p>
@@ -1289,32 +1283,24 @@
           <w:szCs w:val="24"/>
           <w:lang w:val="es-ES_tradnl"/>
         </w:rPr>
-        <w:instrText>\* firstcap</w:instrText>
-      </w:r>
-      <w:r>
-        <w:rPr>
-          <w:sz w:val="24"/>
-          <w:szCs w:val="24"/>
-          <w:lang w:val="es-ES_tradnl"/>
-        </w:rPr>
-        <w:fldChar w:fldCharType="separate"/>
-      </w:r>
-      <w:r>
-        <w:rPr>
-          <w:noProof/>
-          <w:sz w:val="24"/>
-          <w:szCs w:val="24"/>
-          <w:lang w:val="es-ES_tradnl"/>
-        </w:rPr>
-        <w:t>M</w:t>
-      </w:r>
-      <w:r>
-        <w:rPr>
-          <w:sz w:val="24"/>
-          <w:szCs w:val="24"/>
-          <w:lang w:val="es-ES_tradnl"/>
-        </w:rPr>
-        <w:fldChar w:fldCharType="end"/>
+        <w:t>Lugar y jurisdicción policial</w:t>
+      </w:r>
+      <w:r>
+        <w:rPr>
+          <w:sz w:val="24"/>
+          <w:szCs w:val="24"/>
+          <w:lang w:val="es-ES_tradnl"/>
+        </w:rPr>
+        <w:tab/>
+        <w:t>:</w:t>
+      </w:r>
+      <w:r>
+        <w:rPr>
+          <w:sz w:val="24"/>
+          <w:szCs w:val="24"/>
+          <w:lang w:val="es-ES_tradnl"/>
+        </w:rPr>
+        <w:tab/>
       </w:r>
       <w:r>
         <w:rPr>
@@ -1331,7 +1317,7 @@
           <w:szCs w:val="24"/>
           <w:lang w:val="es-ES_tradnl"/>
         </w:rPr>
-        <w:t>acc_consecuencia</w:t>
+        <w:t>acc_lugar_jurisdiccion_policial</w:t>
       </w:r>
       <w:proofErr w:type="spellEnd"/>
       <w:r>
@@ -1341,6 +1327,22 @@
           <w:lang w:val="es-ES_tradnl"/>
         </w:rPr>
         <w:t>}</w:t>
+      </w:r>
+      <w:r>
+        <w:rPr>
+          <w:sz w:val="24"/>
+          <w:szCs w:val="24"/>
+          <w:lang w:val="es-ES_tradnl"/>
+        </w:rPr>
+        <w:t xml:space="preserve"> </w:t>
+      </w:r>
+      <w:r>
+        <w:rPr>
+          <w:sz w:val="24"/>
+          <w:szCs w:val="24"/>
+          <w:lang w:val="es-ES_tradnl"/>
+        </w:rPr>
+        <w:t xml:space="preserve">, </w:t>
       </w:r>
     </w:p>
     <w:p>
@@ -1369,7 +1371,7 @@
           <w:szCs w:val="24"/>
           <w:lang w:val="es-ES_tradnl"/>
         </w:rPr>
-        <w:t>Lugar y jurisdicción policial</w:t>
+        <w:t>Fecha y hora del accidente</w:t>
       </w:r>
       <w:r>
         <w:rPr>
@@ -1403,10 +1405,9 @@
           <w:szCs w:val="24"/>
           <w:lang w:val="es-ES_tradnl"/>
         </w:rPr>
-        <w:t>acc_lugar_jurisdiccion_policial</w:t>
+        <w:t>acc_fecha_hora_accidente</w:t>
       </w:r>
       <w:proofErr w:type="spellEnd"/>
-      <w:proofErr w:type="gramStart"/>
       <w:r>
         <w:rPr>
           <w:sz w:val="24"/>
@@ -1414,31 +1415,6 @@
           <w:lang w:val="es-ES_tradnl"/>
         </w:rPr>
         <w:t>}</w:t>
-      </w:r>
-      <w:r>
-        <w:rPr>
-          <w:sz w:val="24"/>
-          <w:szCs w:val="24"/>
-          <w:lang w:val="es-ES_tradnl"/>
-        </w:rPr>
-        <w:t xml:space="preserve"> </w:t>
-      </w:r>
-      <w:r>
-        <w:rPr>
-          <w:sz w:val="24"/>
-          <w:szCs w:val="24"/>
-          <w:lang w:val="es-ES_tradnl"/>
-        </w:rPr>
-        <w:t>,</w:t>
-      </w:r>
-      <w:proofErr w:type="gramEnd"/>
-      <w:r>
-        <w:rPr>
-          <w:sz w:val="24"/>
-          <w:szCs w:val="24"/>
-          <w:lang w:val="es-ES_tradnl"/>
-        </w:rPr>
-        <w:t xml:space="preserve"> </w:t>
       </w:r>
     </w:p>
     <w:p>
@@ -1467,7 +1443,7 @@
           <w:szCs w:val="24"/>
           <w:lang w:val="es-ES_tradnl"/>
         </w:rPr>
-        <w:t>Fecha y hora del accidente</w:t>
+        <w:t>Fecha y hora de comunicación</w:t>
       </w:r>
       <w:r>
         <w:rPr>
@@ -1501,7 +1477,7 @@
           <w:szCs w:val="24"/>
           <w:lang w:val="es-ES_tradnl"/>
         </w:rPr>
-        <w:t>acc_fecha_hora_accidente</w:t>
+        <w:t>acc_fecha_hora_comunicacion</w:t>
       </w:r>
       <w:proofErr w:type="spellEnd"/>
       <w:r>
@@ -1539,7 +1515,7 @@
           <w:szCs w:val="24"/>
           <w:lang w:val="es-ES_tradnl"/>
         </w:rPr>
-        <w:t>Fecha y hora de comunicación</w:t>
+        <w:t>Fecha y hora de intervención</w:t>
       </w:r>
       <w:r>
         <w:rPr>
@@ -1573,7 +1549,7 @@
           <w:szCs w:val="24"/>
           <w:lang w:val="es-ES_tradnl"/>
         </w:rPr>
-        <w:t>acc_fecha_hora_comunicacion</w:t>
+        <w:t>acc_fecha_hora_intervencion</w:t>
       </w:r>
       <w:proofErr w:type="spellEnd"/>
       <w:r>
@@ -1611,7 +1587,7 @@
           <w:szCs w:val="24"/>
           <w:lang w:val="es-ES_tradnl"/>
         </w:rPr>
-        <w:t>Fecha y hora de intervención</w:t>
+        <w:t>Unidades participantes</w:t>
       </w:r>
       <w:r>
         <w:rPr>
@@ -1645,7 +1621,7 @@
           <w:szCs w:val="24"/>
           <w:lang w:val="es-ES_tradnl"/>
         </w:rPr>
-        <w:t>acc_fecha_hora_intervencion</w:t>
+        <w:t>acc_unidades_participantes</w:t>
       </w:r>
       <w:proofErr w:type="spellEnd"/>
       <w:r>
@@ -1683,7 +1659,7 @@
           <w:szCs w:val="24"/>
           <w:lang w:val="es-ES_tradnl"/>
         </w:rPr>
-        <w:t>Unidades participantes</w:t>
+        <w:t>Clase de vía y zona</w:t>
       </w:r>
       <w:r>
         <w:rPr>
@@ -1704,175 +1680,6 @@
       </w:r>
       <w:r>
         <w:rPr>
-          <w:b/>
-          <w:bCs/>
-          <w:sz w:val="24"/>
-          <w:szCs w:val="24"/>
-          <w:lang w:val="es-ES_tradnl"/>
-        </w:rPr>
-        <w:t xml:space="preserve">UT-1 </w:t>
-      </w:r>
-      <w:r>
-        <w:rPr>
-          <w:b/>
-          <w:bCs/>
-          <w:sz w:val="24"/>
-          <w:szCs w:val="24"/>
-          <w:lang w:val="es-ES_tradnl"/>
-        </w:rPr>
-        <w:fldChar w:fldCharType="begin"/>
-      </w:r>
-      <w:r>
-        <w:rPr>
-          <w:b/>
-          <w:bCs/>
-          <w:sz w:val="24"/>
-          <w:szCs w:val="24"/>
-          <w:lang w:val="es-ES_tradnl"/>
-        </w:rPr>
-        <w:instrText xml:space="preserve"> MERGEFIELD "DATOSTIPO_VEHICULO_VEHICULO1" </w:instrText>
-      </w:r>
-      <w:r>
-        <w:rPr>
-          <w:b/>
-          <w:bCs/>
-          <w:sz w:val="24"/>
-          <w:szCs w:val="24"/>
-          <w:lang w:val="es-ES_tradnl"/>
-        </w:rPr>
-        <w:fldChar w:fldCharType="separate"/>
-      </w:r>
-      <w:r>
-        <w:rPr>
-          <w:b/>
-          <w:bCs/>
-          <w:noProof/>
-          <w:sz w:val="24"/>
-          <w:szCs w:val="24"/>
-          <w:lang w:val="es-ES_tradnl"/>
-        </w:rPr>
-        <w:t>Ómnibus</w:t>
-      </w:r>
-      <w:r>
-        <w:rPr>
-          <w:b/>
-          <w:bCs/>
-          <w:sz w:val="24"/>
-          <w:szCs w:val="24"/>
-          <w:lang w:val="es-ES_tradnl"/>
-        </w:rPr>
-        <w:fldChar w:fldCharType="end"/>
-      </w:r>
-      <w:r>
-        <w:rPr>
-          <w:b/>
-          <w:bCs/>
-          <w:sz w:val="24"/>
-          <w:szCs w:val="24"/>
-          <w:lang w:val="es-ES_tradnl"/>
-        </w:rPr>
-        <w:t xml:space="preserve"> </w:t>
-      </w:r>
-      <w:r>
-        <w:rPr>
-          <w:b/>
-          <w:bCs/>
-          <w:sz w:val="24"/>
-          <w:szCs w:val="24"/>
-          <w:lang w:val="es-ES_tradnl"/>
-        </w:rPr>
-        <w:t>con placa</w:t>
-      </w:r>
-      <w:r>
-        <w:rPr>
-          <w:b/>
-          <w:bCs/>
-          <w:sz w:val="24"/>
-          <w:szCs w:val="24"/>
-          <w:lang w:val="es-ES_tradnl"/>
-        </w:rPr>
-        <w:t xml:space="preserve"> </w:t>
-      </w:r>
-      <w:r>
-        <w:rPr>
-          <w:b/>
-          <w:bCs/>
-          <w:sz w:val="24"/>
-          <w:szCs w:val="24"/>
-          <w:lang w:val="es-ES_tradnl"/>
-        </w:rPr>
-        <w:fldChar w:fldCharType="begin"/>
-      </w:r>
-      <w:r>
-        <w:rPr>
-          <w:b/>
-          <w:bCs/>
-          <w:sz w:val="24"/>
-          <w:szCs w:val="24"/>
-          <w:lang w:val="es-ES_tradnl"/>
-        </w:rPr>
-        <w:instrText xml:space="preserve"> MERGEFIELD "DATOSPLACA_VEHICULO1" </w:instrText>
-      </w:r>
-      <w:r>
-        <w:rPr>
-          <w:b/>
-          <w:bCs/>
-          <w:sz w:val="24"/>
-          <w:szCs w:val="24"/>
-          <w:lang w:val="es-ES_tradnl"/>
-        </w:rPr>
-        <w:fldChar w:fldCharType="separate"/>
-      </w:r>
-      <w:r>
-        <w:rPr>
-          <w:b/>
-          <w:bCs/>
-          <w:noProof/>
-          <w:sz w:val="24"/>
-          <w:szCs w:val="24"/>
-          <w:lang w:val="es-ES_tradnl"/>
-        </w:rPr>
-        <w:t>ASY-920</w:t>
-      </w:r>
-      <w:r>
-        <w:rPr>
-          <w:b/>
-          <w:bCs/>
-          <w:sz w:val="24"/>
-          <w:szCs w:val="24"/>
-          <w:lang w:val="es-ES_tradnl"/>
-        </w:rPr>
-        <w:fldChar w:fldCharType="end"/>
-      </w:r>
-      <w:r>
-        <w:rPr>
-          <w:b/>
-          <w:bCs/>
-          <w:sz w:val="24"/>
-          <w:szCs w:val="24"/>
-          <w:lang w:val="es-ES_tradnl"/>
-        </w:rPr>
-        <w:t>:</w:t>
-      </w:r>
-    </w:p>
-    <w:p>
-      <w:pPr>
-        <w:pStyle w:val="Prrafodelista"/>
-        <w:tabs>
-          <w:tab w:val="left" w:pos="742"/>
-          <w:tab w:val="left" w:pos="4111"/>
-          <w:tab w:val="left" w:pos="4395"/>
-        </w:tabs>
-        <w:ind w:left="4354" w:firstLine="0"/>
-        <w:jc w:val="both"/>
-        <w:rPr>
-          <w:sz w:val="24"/>
-          <w:szCs w:val="24"/>
-          <w:lang w:val="es-ES_tradnl"/>
-        </w:rPr>
-      </w:pPr>
-      <w:r>
-        <w:rPr>
           <w:sz w:val="24"/>
           <w:szCs w:val="24"/>
           <w:lang w:val="es-ES_tradnl"/>
@@ -1886,7 +1693,7 @@
           <w:szCs w:val="24"/>
           <w:lang w:val="es-ES_tradnl"/>
         </w:rPr>
-        <w:t>acc_unidades_participantes</w:t>
+        <w:t>acc_clase_via_zona</w:t>
       </w:r>
       <w:proofErr w:type="spellEnd"/>
       <w:r>
@@ -1924,82 +1731,8 @@
           <w:szCs w:val="24"/>
           <w:lang w:val="es-ES_tradnl"/>
         </w:rPr>
-        <w:t>Clase de vía y zona</w:t>
-      </w:r>
-      <w:r>
-        <w:rPr>
-          <w:sz w:val="24"/>
-          <w:szCs w:val="24"/>
-          <w:lang w:val="es-ES_tradnl"/>
-        </w:rPr>
-        <w:tab/>
-        <w:t>:</w:t>
-      </w:r>
-      <w:r>
-        <w:rPr>
-          <w:sz w:val="24"/>
-          <w:szCs w:val="24"/>
-          <w:lang w:val="es-ES_tradnl"/>
-        </w:rPr>
-        <w:tab/>
-      </w:r>
-      <w:r>
-        <w:rPr>
-          <w:sz w:val="24"/>
-          <w:szCs w:val="24"/>
-          <w:lang w:val="es-ES_tradnl"/>
-        </w:rPr>
-        <w:t>${</w:t>
-      </w:r>
-      <w:proofErr w:type="spellStart"/>
-      <w:r>
-        <w:rPr>
-          <w:sz w:val="24"/>
-          <w:szCs w:val="24"/>
-          <w:lang w:val="es-ES_tradnl"/>
-        </w:rPr>
-        <w:t>acc_clase_via_zona</w:t>
-      </w:r>
-      <w:proofErr w:type="spellEnd"/>
-      <w:r>
-        <w:rPr>
-          <w:sz w:val="24"/>
-          <w:szCs w:val="24"/>
-          <w:lang w:val="es-ES_tradnl"/>
-        </w:rPr>
-        <w:t>}</w:t>
-      </w:r>
-    </w:p>
-    <w:p>
-      <w:pPr>
-        <w:pStyle w:val="Prrafodelista"/>
-        <w:numPr>
-          <w:ilvl w:val="0"/>
-          <w:numId w:val="3"/>
-        </w:numPr>
-        <w:tabs>
-          <w:tab w:val="left" w:pos="742"/>
-          <w:tab w:val="left" w:pos="4111"/>
-          <w:tab w:val="left" w:pos="4395"/>
-        </w:tabs>
-        <w:ind w:left="4354" w:hanging="3994"/>
-        <w:jc w:val="both"/>
-        <w:rPr>
-          <w:sz w:val="24"/>
-          <w:szCs w:val="24"/>
-          <w:lang w:val="es-ES_tradnl"/>
-        </w:rPr>
-      </w:pPr>
-      <w:proofErr w:type="spellStart"/>
-      <w:r>
-        <w:rPr>
-          <w:sz w:val="24"/>
-          <w:szCs w:val="24"/>
-          <w:lang w:val="es-ES_tradnl"/>
-        </w:rPr>
-        <w:t>Fiscalia</w:t>
-      </w:r>
-      <w:proofErr w:type="spellEnd"/>
+        <w:t>Fiscalía</w:t>
+      </w:r>
       <w:r>
         <w:rPr>
           <w:sz w:val="24"/>
@@ -7266,6 +6999,7 @@
   <w:style w:type="character" w:default="1" w:styleId="Fuentedeprrafopredeter">
     <w:name w:val="Default Paragraph Font"/>
     <w:uiPriority w:val="1"/>
+    <w:semiHidden/>
     <w:unhideWhenUsed/>
   </w:style>
   <w:style w:type="table" w:default="1" w:styleId="Tablanormal">

</xml_diff>